<commit_message>
Release 0.2.0 contract hardening
</commit_message>
<xml_diff>
--- a/journals/example-compact-journal/reference.docx
+++ b/journals/example-compact-journal/reference.docx
@@ -12117,12 +12117,24 @@
       <w:sz w:val="24"/>
     </w:rPr>
   </w:style>
-  <w:style w:type="paragraph" w:customStyle="1" w:styleId="Abstract">
-    <w:name w:val="Abstract"/>
+  <w:style w:type="paragraph" w:customStyle="1" w:styleId="FirstParagraph">
+    <w:name w:val="First Paragraph"/>
     <w:basedOn w:val="Normal"/>
     <w:pPr>
-      <w:spacing w:line="300" w:lineRule="auto"/>
+      <w:spacing w:line="360" w:lineRule="auto" w:after="0"/>
       <w:jc w:val="both"/>
+      <w:ind w:firstLineChars="200"/>
+    </w:pPr>
+    <w:rPr>
+      <w:rFonts w:ascii="Times New Roman" w:hAnsi="Times New Roman" w:cs="Times New Roman" w:eastAsia="仿宋"/>
+      <w:sz w:val="21"/>
+    </w:rPr>
+  </w:style>
+  <w:style w:type="paragraph" w:customStyle="1" w:styleId="FootnoteText">
+    <w:name w:val="Footnote Text"/>
+    <w:basedOn w:val="Normal"/>
+    <w:pPr>
+      <w:spacing w:line="240" w:lineRule="auto"/>
       <w:ind/>
     </w:pPr>
     <w:rPr>
@@ -12130,37 +12142,22 @@
       <w:sz w:val="21"/>
     </w:rPr>
   </w:style>
-  <w:style w:type="paragraph" w:customStyle="1" w:styleId="Keywords">
-    <w:name w:val="Keywords"/>
+  <w:style w:type="paragraph" w:customStyle="1" w:styleId="Bibliography">
+    <w:name w:val="Bibliography"/>
     <w:basedOn w:val="Normal"/>
     <w:pPr>
-      <w:spacing w:after="160"/>
-      <w:jc w:val="left"/>
-      <w:ind/>
+      <w:spacing w:line="240" w:lineRule="auto"/>
+      <w:ind w:hangingChars="200"/>
     </w:pPr>
     <w:rPr>
       <w:rFonts w:ascii="Times New Roman" w:hAnsi="Times New Roman" w:cs="Times New Roman" w:eastAsia="宋体"/>
       <w:sz w:val="21"/>
     </w:rPr>
   </w:style>
-  <w:style w:type="paragraph" w:customStyle="1" w:styleId="FirstParagraph">
-    <w:name w:val="First Paragraph"/>
+  <w:style w:type="paragraph" w:customStyle="1" w:styleId="Funding">
+    <w:name w:val="Funding"/>
     <w:basedOn w:val="Normal"/>
     <w:pPr>
-      <w:spacing w:line="360" w:lineRule="auto" w:after="0"/>
-      <w:jc w:val="both"/>
-      <w:ind w:firstLineChars="200"/>
-    </w:pPr>
-    <w:rPr>
-      <w:rFonts w:ascii="Times New Roman" w:hAnsi="Times New Roman" w:cs="Times New Roman" w:eastAsia="仿宋"/>
-      <w:sz w:val="21"/>
-    </w:rPr>
-  </w:style>
-  <w:style w:type="paragraph" w:customStyle="1" w:styleId="FootnoteText">
-    <w:name w:val="Footnote Text"/>
-    <w:basedOn w:val="Normal"/>
-    <w:pPr>
-      <w:spacing w:line="240" w:lineRule="auto"/>
       <w:ind/>
     </w:pPr>
     <w:rPr>
@@ -12168,22 +12165,23 @@
       <w:sz w:val="21"/>
     </w:rPr>
   </w:style>
-  <w:style w:type="paragraph" w:customStyle="1" w:styleId="Bibliography">
-    <w:name w:val="Bibliography"/>
+  <w:style w:type="paragraph" w:customStyle="1" w:styleId="ImageCaption">
+    <w:name w:val="Image Caption"/>
     <w:basedOn w:val="Normal"/>
     <w:pPr>
-      <w:spacing w:line="240" w:lineRule="auto"/>
-      <w:ind w:hangingChars="200"/>
+      <w:jc w:val="center"/>
+      <w:ind/>
     </w:pPr>
     <w:rPr>
       <w:rFonts w:ascii="Times New Roman" w:hAnsi="Times New Roman" w:cs="Times New Roman" w:eastAsia="宋体"/>
       <w:sz w:val="21"/>
     </w:rPr>
   </w:style>
-  <w:style w:type="paragraph" w:customStyle="1" w:styleId="Funding">
-    <w:name w:val="Funding"/>
+  <w:style w:type="paragraph" w:customStyle="1" w:styleId="TableCaption">
+    <w:name w:val="Table Caption"/>
     <w:basedOn w:val="Normal"/>
     <w:pPr>
+      <w:jc w:val="center"/>
       <w:ind/>
     </w:pPr>
     <w:rPr>
@@ -12191,11 +12189,12 @@
       <w:sz w:val="21"/>
     </w:rPr>
   </w:style>
-  <w:style w:type="paragraph" w:customStyle="1" w:styleId="ImageCaption">
-    <w:name w:val="Image Caption"/>
+  <w:style w:type="paragraph" w:customStyle="1" w:styleId="Abstract">
+    <w:name w:val="Abstract"/>
     <w:basedOn w:val="Normal"/>
     <w:pPr>
-      <w:jc w:val="center"/>
+      <w:spacing w:line="300" w:lineRule="auto"/>
+      <w:jc w:val="both"/>
       <w:ind/>
     </w:pPr>
     <w:rPr>
@@ -12203,13 +12202,74 @@
       <w:sz w:val="21"/>
     </w:rPr>
   </w:style>
-  <w:style w:type="paragraph" w:customStyle="1" w:styleId="TableCaption">
-    <w:name w:val="Table Caption"/>
+  <w:style w:type="paragraph" w:customStyle="1" w:styleId="Keywords">
+    <w:name w:val="Keywords"/>
     <w:basedOn w:val="Normal"/>
     <w:pPr>
-      <w:jc w:val="center"/>
+      <w:spacing w:after="160"/>
+      <w:jc w:val="left"/>
       <w:ind/>
     </w:pPr>
+    <w:rPr>
+      <w:rFonts w:ascii="Times New Roman" w:hAnsi="Times New Roman" w:cs="Times New Roman" w:eastAsia="宋体"/>
+      <w:sz w:val="21"/>
+    </w:rPr>
+  </w:style>
+  <w:style w:type="character" w:customStyle="1" w:styleId="AbstractzhLabel">
+    <w:name w:val="Abstract zh Label"/>
+    <w:rPr>
+      <w:rFonts w:ascii="Times New Roman" w:hAnsi="Times New Roman" w:cs="Times New Roman" w:eastAsia="宋体"/>
+      <w:b/>
+      <w:sz w:val="21"/>
+    </w:rPr>
+  </w:style>
+  <w:style w:type="character" w:customStyle="1" w:styleId="AbstractzhBody">
+    <w:name w:val="Abstract zh Body"/>
+    <w:rPr>
+      <w:rFonts w:ascii="Times New Roman" w:hAnsi="Times New Roman" w:cs="Times New Roman" w:eastAsia="宋体"/>
+      <w:sz w:val="21"/>
+    </w:rPr>
+  </w:style>
+  <w:style w:type="character" w:customStyle="1" w:styleId="AbstractenLabel">
+    <w:name w:val="Abstract en Label"/>
+    <w:rPr>
+      <w:rFonts w:ascii="Times New Roman" w:hAnsi="Times New Roman" w:cs="Times New Roman" w:eastAsia="宋体"/>
+      <w:b/>
+      <w:sz w:val="21"/>
+    </w:rPr>
+  </w:style>
+  <w:style w:type="character" w:customStyle="1" w:styleId="AbstractenBody">
+    <w:name w:val="Abstract en Body"/>
+    <w:rPr>
+      <w:rFonts w:ascii="Times New Roman" w:hAnsi="Times New Roman" w:cs="Times New Roman" w:eastAsia="宋体"/>
+      <w:sz w:val="21"/>
+    </w:rPr>
+  </w:style>
+  <w:style w:type="character" w:customStyle="1" w:styleId="KeywordszhLabel">
+    <w:name w:val="Keywords zh Label"/>
+    <w:rPr>
+      <w:rFonts w:ascii="Times New Roman" w:hAnsi="Times New Roman" w:cs="Times New Roman" w:eastAsia="宋体"/>
+      <w:b/>
+      <w:sz w:val="21"/>
+    </w:rPr>
+  </w:style>
+  <w:style w:type="character" w:customStyle="1" w:styleId="KeywordszhBody">
+    <w:name w:val="Keywords zh Body"/>
+    <w:rPr>
+      <w:rFonts w:ascii="Times New Roman" w:hAnsi="Times New Roman" w:cs="Times New Roman" w:eastAsia="宋体"/>
+      <w:sz w:val="21"/>
+    </w:rPr>
+  </w:style>
+  <w:style w:type="character" w:customStyle="1" w:styleId="KeywordsenLabel">
+    <w:name w:val="Keywords en Label"/>
+    <w:rPr>
+      <w:rFonts w:ascii="Times New Roman" w:hAnsi="Times New Roman" w:cs="Times New Roman" w:eastAsia="宋体"/>
+      <w:b/>
+      <w:sz w:val="21"/>
+    </w:rPr>
+  </w:style>
+  <w:style w:type="character" w:customStyle="1" w:styleId="KeywordsenBody">
+    <w:name w:val="Keywords en Body"/>
     <w:rPr>
       <w:rFonts w:ascii="Times New Roman" w:hAnsi="Times New Roman" w:cs="Times New Roman" w:eastAsia="宋体"/>
       <w:sz w:val="21"/>

</xml_diff>